<commit_message>
ajout du rapport .pdf
</commit_message>
<xml_diff>
--- a/Projet sécurisation des données sur une API vulnérable.docx
+++ b/Projet sécurisation des données sur une API vulnérable.docx
@@ -1566,7 +1566,7 @@
           <w:noProof/>
         </w:rPr>
         <w:drawing>
-          <wp:inline distT="0" distB="0" distL="0" distR="0" wp14:anchorId="59740DCD" wp14:editId="090E9367">
+          <wp:inline distT="0" distB="0" distL="0" distR="0" wp14:anchorId="59740DCD" wp14:editId="5D60FFB9">
             <wp:extent cx="6213475" cy="2757805"/>
             <wp:effectExtent l="0" t="0" r="0" b="4445"/>
             <wp:docPr id="1420811041" name="Image 1"/>
@@ -1626,7 +1626,7 @@
           <w:noProof/>
         </w:rPr>
         <w:drawing>
-          <wp:inline distT="0" distB="0" distL="0" distR="0" wp14:anchorId="06D92DCA" wp14:editId="21A66F75">
+          <wp:inline distT="0" distB="0" distL="0" distR="0" wp14:anchorId="06D92DCA" wp14:editId="2B2C4BB4">
             <wp:extent cx="6213475" cy="2589530"/>
             <wp:effectExtent l="0" t="0" r="0" b="1270"/>
             <wp:docPr id="1440890705" name="Image 3"/>
@@ -2610,12 +2610,21 @@
           <w:sz w:val="24"/>
         </w:rPr>
       </w:pPr>
-      <w:r>
-        <w:rPr>
-          <w:rFonts w:ascii="Aptos" w:hAnsi="Aptos"/>
-          <w:sz w:val="24"/>
-        </w:rPr>
-        <w:t>http : pas de HTTPS ; trafic et identifiants transitent en clair.</w:t>
+      <w:proofErr w:type="gramStart"/>
+      <w:r>
+        <w:rPr>
+          <w:rFonts w:ascii="Aptos" w:hAnsi="Aptos"/>
+          <w:sz w:val="24"/>
+        </w:rPr>
+        <w:t>http</w:t>
+      </w:r>
+      <w:proofErr w:type="gramEnd"/>
+      <w:r>
+        <w:rPr>
+          <w:rFonts w:ascii="Aptos" w:hAnsi="Aptos"/>
+          <w:sz w:val="24"/>
+        </w:rPr>
+        <w:t> : pas de HTTPS ; trafic et identifiants transitent en clair.</w:t>
       </w:r>
     </w:p>
     <w:p>
@@ -2716,12 +2725,21 @@
         <w:t>accès au tableau de bord d’un autre utilisateur via `</w:t>
       </w:r>
       <w:proofErr w:type="spellStart"/>
-      <w:r>
-        <w:rPr>
-          <w:rFonts w:ascii="Aptos" w:hAnsi="Aptos"/>
-          <w:sz w:val="24"/>
-        </w:rPr>
-        <w:t>dashboard.php?user_id</w:t>
+      <w:proofErr w:type="gramStart"/>
+      <w:r>
+        <w:rPr>
+          <w:rFonts w:ascii="Aptos" w:hAnsi="Aptos"/>
+          <w:sz w:val="24"/>
+        </w:rPr>
+        <w:t>dashboard.php?</w:t>
+      </w:r>
+      <w:proofErr w:type="gramEnd"/>
+      <w:r>
+        <w:rPr>
+          <w:rFonts w:ascii="Aptos" w:hAnsi="Aptos"/>
+          <w:sz w:val="24"/>
+        </w:rPr>
+        <w:t>user_id</w:t>
       </w:r>
       <w:proofErr w:type="spellEnd"/>
       <w:r>
@@ -3154,12 +3172,21 @@
         <w:t>   - Saisie manuelle de `</w:t>
       </w:r>
       <w:proofErr w:type="spellStart"/>
-      <w:r>
-        <w:rPr>
-          <w:rFonts w:ascii="Aptos" w:hAnsi="Aptos"/>
-          <w:sz w:val="24"/>
-        </w:rPr>
-        <w:t>dashboard.php?user_id</w:t>
+      <w:proofErr w:type="gramStart"/>
+      <w:r>
+        <w:rPr>
+          <w:rFonts w:ascii="Aptos" w:hAnsi="Aptos"/>
+          <w:sz w:val="24"/>
+        </w:rPr>
+        <w:t>dashboard.php?</w:t>
+      </w:r>
+      <w:proofErr w:type="gramEnd"/>
+      <w:r>
+        <w:rPr>
+          <w:rFonts w:ascii="Aptos" w:hAnsi="Aptos"/>
+          <w:sz w:val="24"/>
+        </w:rPr>
+        <w:t>user_id</w:t>
       </w:r>
       <w:proofErr w:type="spellEnd"/>
       <w:r>
@@ -3548,7 +3575,7 @@
         </w:rPr>
         <w:lastRenderedPageBreak/>
         <w:drawing>
-          <wp:inline distT="0" distB="0" distL="0" distR="0" wp14:anchorId="5D1291E6" wp14:editId="60A7D515">
+          <wp:inline distT="0" distB="0" distL="0" distR="0" wp14:anchorId="5D1291E6" wp14:editId="5904E0AE">
             <wp:extent cx="6213475" cy="2737485"/>
             <wp:effectExtent l="0" t="0" r="0" b="5715"/>
             <wp:docPr id="2022410880" name="Image 4"/>
@@ -4007,10 +4034,7 @@
         <w:ind w:left="0"/>
       </w:pPr>
       <w:r>
-        <w:t>Mise</w:t>
-      </w:r>
-      <w:r>
-        <w:t xml:space="preserve"> en place </w:t>
+        <w:t xml:space="preserve">Mise en place </w:t>
       </w:r>
       <w:r>
         <w:t>d’</w:t>
@@ -4039,13 +4063,7 @@
         <w:t>adapté aux mots de passe</w:t>
       </w:r>
       <w:r>
-        <w:t xml:space="preserve"> </w:t>
-      </w:r>
-      <w:r>
-        <w:t>(avec sel et paramètres de coût appropriés)</w:t>
-      </w:r>
-      <w:r>
-        <w:t>.</w:t>
+        <w:t xml:space="preserve"> (avec sel et paramètres de coût appropriés).</w:t>
       </w:r>
       <w:r>
         <w:t xml:space="preserve">  </w:t>
@@ -4252,35 +4270,42 @@
         <w:t>L</w:t>
       </w:r>
       <w:r>
-        <w:t xml:space="preserve">es mots de passe ne </w:t>
-      </w:r>
-      <w:r>
-        <w:t>sont</w:t>
-      </w:r>
-      <w:r>
-        <w:t xml:space="preserve"> jamais stockés ou affichés en texte clair, ni dans la base de données, ni dans les journaux</w:t>
-      </w:r>
-      <w:r>
-        <w:t xml:space="preserve"> (logs).</w:t>
+        <w:t>es mots de passe ne sont jamais stockés ou affichés en texte clair, ni dans la base de données, ni dans les journaux (logs).</w:t>
       </w:r>
       <w:r>
         <w:t xml:space="preserve"> Pour vérifier si un mot de passe en clair correspond bien au hachage stocké en base (celui produit par `</w:t>
       </w:r>
       <w:proofErr w:type="spellStart"/>
       <w:r>
-        <w:t>password_hash</w:t>
+        <w:t>password_</w:t>
+      </w:r>
+      <w:proofErr w:type="gramStart"/>
+      <w:r>
+        <w:t>hash</w:t>
       </w:r>
       <w:proofErr w:type="spellEnd"/>
       <w:r>
-        <w:t>()`), on utilise la fonction PHP `</w:t>
+        <w:t>(</w:t>
+      </w:r>
+      <w:proofErr w:type="gramEnd"/>
+      <w:r>
+        <w:t>)`), on utilise la fonction PHP `</w:t>
       </w:r>
       <w:proofErr w:type="spellStart"/>
       <w:r>
-        <w:t>password_verify</w:t>
+        <w:t>password_</w:t>
+      </w:r>
+      <w:proofErr w:type="gramStart"/>
+      <w:r>
+        <w:t>verify</w:t>
       </w:r>
       <w:proofErr w:type="spellEnd"/>
       <w:r>
-        <w:t>()`, qui retourne `</w:t>
+        <w:t>(</w:t>
+      </w:r>
+      <w:proofErr w:type="gramEnd"/>
+      <w:r>
+        <w:t>)`, qui retourne `</w:t>
       </w:r>
       <w:proofErr w:type="spellStart"/>
       <w:r>
@@ -4476,39 +4501,240 @@
           <w:sz w:val="28"/>
           <w:szCs w:val="28"/>
         </w:rPr>
-        <w:t xml:space="preserve">5.  </w:t>
-      </w:r>
-      <w:r>
+        <w:t>5.  Certificat numérique, HTTPS et journalisation</w:t>
+      </w:r>
+    </w:p>
+    <w:p>
+      <w:pPr>
+        <w:pStyle w:val="Titre3"/>
         <w:rPr>
           <w:rFonts w:ascii="Aptos Display" w:hAnsi="Aptos Display"/>
           <w:b/>
           <w:bCs/>
           <w:color w:val="auto"/>
-          <w:sz w:val="28"/>
-          <w:szCs w:val="28"/>
-        </w:rPr>
-        <w:t>Certificat numérique, HTTPS et journalisation</w:t>
-      </w:r>
-    </w:p>
-    <w:p>
-      <w:pPr>
-        <w:pStyle w:val="Titre3"/>
+        </w:rPr>
+      </w:pPr>
+      <w:r>
         <w:rPr>
           <w:rFonts w:ascii="Aptos Display" w:hAnsi="Aptos Display"/>
           <w:b/>
           <w:bCs/>
           <w:color w:val="auto"/>
         </w:rPr>
-      </w:pPr>
-      <w:r>
+        <w:t>5.1. Certificat numérique</w:t>
+      </w:r>
+    </w:p>
+    <w:p/>
+    <w:p>
+      <w:pPr>
+        <w:pStyle w:val="Corpsdetexte"/>
+        <w:rPr>
+          <w:sz w:val="22"/>
+          <w:szCs w:val="22"/>
+        </w:rPr>
+      </w:pPr>
+      <w:r>
+        <w:rPr>
+          <w:sz w:val="22"/>
+          <w:szCs w:val="22"/>
+        </w:rPr>
+        <w:t xml:space="preserve">La génération d’un certificat auto-signé repose sur l’utilisation de l’outil </w:t>
+      </w:r>
+      <w:proofErr w:type="spellStart"/>
+      <w:r>
+        <w:rPr>
+          <w:sz w:val="22"/>
+          <w:szCs w:val="22"/>
+        </w:rPr>
+        <w:t>OpenSSL</w:t>
+      </w:r>
+      <w:proofErr w:type="spellEnd"/>
+      <w:r>
+        <w:rPr>
+          <w:sz w:val="22"/>
+          <w:szCs w:val="22"/>
+        </w:rPr>
+        <w:t>, qui permet de créer à la fois une clé privée et un certificat X.509 associé.</w:t>
+      </w:r>
+    </w:p>
+    <w:p>
+      <w:pPr>
+        <w:pStyle w:val="Corpsdetexte"/>
+        <w:rPr>
+          <w:sz w:val="22"/>
+          <w:szCs w:val="22"/>
+        </w:rPr>
+      </w:pPr>
+      <w:r>
+        <w:rPr>
+          <w:sz w:val="22"/>
+          <w:szCs w:val="22"/>
+        </w:rPr>
+        <w:t xml:space="preserve">Dans un premier temps, on se place dans le répertoire dédié aux certificats, puis on exécute une commande qui demande à </w:t>
+      </w:r>
+      <w:proofErr w:type="spellStart"/>
+      <w:r>
+        <w:rPr>
+          <w:sz w:val="22"/>
+          <w:szCs w:val="22"/>
+        </w:rPr>
+        <w:t>OpenSSL</w:t>
+      </w:r>
+      <w:proofErr w:type="spellEnd"/>
+      <w:r>
+        <w:rPr>
+          <w:sz w:val="22"/>
+          <w:szCs w:val="22"/>
+        </w:rPr>
+        <w:t xml:space="preserve"> de générer une nouvelle paire clé/certificat. Cette commande utilise l’algorithme RSA avec une taille de clé de 2048 bits, ce qui constitue aujourd’hui un standard de sécurité courant. Le certificat est auto-signé grâce à l’option -x509, ce qui signifie qu’il est signé par sa propre clé privée et non par une autorité de certification externe.</w:t>
+      </w:r>
+    </w:p>
+    <w:p>
+      <w:pPr>
+        <w:pStyle w:val="Corpsdetexte"/>
+        <w:rPr>
+          <w:sz w:val="22"/>
+          <w:szCs w:val="22"/>
+        </w:rPr>
+      </w:pPr>
+    </w:p>
+    <w:p>
+      <w:pPr>
+        <w:pStyle w:val="Corpsdetexte"/>
+        <w:rPr>
+          <w:sz w:val="20"/>
+        </w:rPr>
+      </w:pPr>
+      <w:r>
+        <w:rPr>
+          <w:sz w:val="22"/>
+          <w:szCs w:val="22"/>
+        </w:rPr>
+        <w:t xml:space="preserve">La durée de validité du certificat est fixée à </w:t>
+      </w:r>
+      <w:r>
+        <w:rPr>
+          <w:sz w:val="22"/>
+          <w:szCs w:val="22"/>
+        </w:rPr>
+        <w:t>1 an</w:t>
+      </w:r>
+      <w:r>
+        <w:rPr>
+          <w:sz w:val="22"/>
+          <w:szCs w:val="22"/>
+        </w:rPr>
+        <w:t xml:space="preserve"> </w:t>
+      </w:r>
+      <w:r>
+        <w:rPr>
+          <w:sz w:val="22"/>
+          <w:szCs w:val="22"/>
+        </w:rPr>
+        <w:t>(-</w:t>
+      </w:r>
+      <w:proofErr w:type="spellStart"/>
+      <w:r>
+        <w:rPr>
+          <w:sz w:val="22"/>
+          <w:szCs w:val="22"/>
+        </w:rPr>
+        <w:t>days</w:t>
+      </w:r>
+      <w:proofErr w:type="spellEnd"/>
+      <w:r>
+        <w:rPr>
+          <w:sz w:val="22"/>
+          <w:szCs w:val="22"/>
+        </w:rPr>
+        <w:t xml:space="preserve"> 365). L’option -</w:t>
+      </w:r>
+      <w:proofErr w:type="spellStart"/>
+      <w:r>
+        <w:rPr>
+          <w:sz w:val="22"/>
+          <w:szCs w:val="22"/>
+        </w:rPr>
+        <w:t>nodes</w:t>
+      </w:r>
+      <w:proofErr w:type="spellEnd"/>
+      <w:r>
+        <w:rPr>
+          <w:sz w:val="22"/>
+          <w:szCs w:val="22"/>
+        </w:rPr>
+        <w:t xml:space="preserve"> permet de ne pas chiffrer la clé privée avec un mot de passe, ce qui simplifie son utilisation dans des environnements de test ou de développement. Enfin, le champ -subj permet de définir directement les informations d’identité du certificat (comme le nom commun CN=localhost, l’organisation et le pays), sans interaction utilisateur.</w:t>
+      </w:r>
+    </w:p>
+    <w:p>
+      <w:pPr>
+        <w:pStyle w:val="Corpsdetexte"/>
+        <w:ind w:left="0"/>
+      </w:pPr>
+    </w:p>
+    <w:p>
+      <w:pPr>
+        <w:pStyle w:val="Corpsdetexte"/>
+      </w:pPr>
+      <w:r>
+        <w:t>Une fois le certificat généré, plusieurs vérifications permettent de s’assurer de sa validité et de sa cohérence.</w:t>
+      </w:r>
+      <w:r>
+        <w:t xml:space="preserve"> On effectue plusieurs vérifications, on vérifie</w:t>
+      </w:r>
+      <w:r>
+        <w:t xml:space="preserve"> sa validité temporelle et son contenu,</w:t>
+      </w:r>
+      <w:r>
+        <w:t xml:space="preserve"> </w:t>
+      </w:r>
+      <w:r>
+        <w:t>sa conformité syntaxique</w:t>
+      </w:r>
+      <w:r>
+        <w:t xml:space="preserve"> </w:t>
+      </w:r>
+      <w:r>
+        <w:t xml:space="preserve">et sa cohérence avec la </w:t>
+      </w:r>
+      <w:r>
+        <w:t>correspondance clé/certificat, qui sera ensuite condensé à l’aide de la fonction de hachage MD5</w:t>
+      </w:r>
+      <w:r>
+        <w:t xml:space="preserve"> afin d’obtenir des empreintes comparables, si les deux sont identiques alors la paire est cohérente</w:t>
+      </w:r>
+      <w:r>
+        <w:t>.</w:t>
+      </w:r>
+    </w:p>
+    <w:p>
+      <w:pPr>
+        <w:pStyle w:val="Corpsdetexte"/>
+        <w:ind w:left="0"/>
+      </w:pPr>
+      <w:r>
+        <w:t>Ces étapes sont essentielles pour éviter des erreurs de configuration, notamment lors de la mise en place de connexions sécurisées (HTTPS, TLS)</w:t>
+      </w:r>
+      <w:r>
+        <w:t>.</w:t>
+      </w:r>
+    </w:p>
+    <w:p>
+      <w:pPr>
+        <w:pStyle w:val="Corpsdetexte"/>
+        <w:ind w:left="0"/>
+      </w:pPr>
+    </w:p>
+    <w:p>
+      <w:pPr>
+        <w:pStyle w:val="Titre3"/>
         <w:rPr>
           <w:rFonts w:ascii="Aptos Display" w:hAnsi="Aptos Display"/>
           <w:b/>
           <w:bCs/>
           <w:color w:val="auto"/>
         </w:rPr>
-        <w:t xml:space="preserve">5.1. </w:t>
-      </w:r>
+      </w:pPr>
       <w:r>
         <w:rPr>
           <w:rFonts w:ascii="Aptos Display" w:hAnsi="Aptos Display"/>
@@ -4516,220 +4742,17 @@
           <w:bCs/>
           <w:color w:val="auto"/>
         </w:rPr>
-        <w:t>Certificat numérique</w:t>
-      </w:r>
-    </w:p>
-    <w:p/>
-    <w:p>
-      <w:pPr>
-        <w:pStyle w:val="Corpsdetexte"/>
-        <w:rPr>
-          <w:sz w:val="22"/>
-          <w:szCs w:val="22"/>
-        </w:rPr>
-      </w:pPr>
-      <w:r>
-        <w:rPr>
-          <w:sz w:val="22"/>
-          <w:szCs w:val="22"/>
-        </w:rPr>
-        <w:t xml:space="preserve">La génération d’un certificat auto-signé repose sur l’utilisation de l’outil </w:t>
-      </w:r>
-      <w:proofErr w:type="spellStart"/>
-      <w:r>
-        <w:rPr>
-          <w:sz w:val="22"/>
-          <w:szCs w:val="22"/>
-        </w:rPr>
-        <w:t>OpenSSL</w:t>
-      </w:r>
-      <w:proofErr w:type="spellEnd"/>
-      <w:r>
-        <w:rPr>
-          <w:sz w:val="22"/>
-          <w:szCs w:val="22"/>
-        </w:rPr>
-        <w:t>, qui permet de créer à la fois une clé privée et un certificat X.509 associé.</w:t>
-      </w:r>
-    </w:p>
-    <w:p>
-      <w:pPr>
-        <w:pStyle w:val="Corpsdetexte"/>
-        <w:rPr>
-          <w:sz w:val="22"/>
-          <w:szCs w:val="22"/>
-        </w:rPr>
-      </w:pPr>
-      <w:r>
-        <w:rPr>
-          <w:sz w:val="22"/>
-          <w:szCs w:val="22"/>
-        </w:rPr>
-        <w:t xml:space="preserve">Dans un premier temps, on se place dans le répertoire dédié aux certificats, puis on exécute une commande qui demande à </w:t>
-      </w:r>
-      <w:proofErr w:type="spellStart"/>
-      <w:r>
-        <w:rPr>
-          <w:sz w:val="22"/>
-          <w:szCs w:val="22"/>
-        </w:rPr>
-        <w:t>OpenSSL</w:t>
-      </w:r>
-      <w:proofErr w:type="spellEnd"/>
-      <w:r>
-        <w:rPr>
-          <w:sz w:val="22"/>
-          <w:szCs w:val="22"/>
-        </w:rPr>
-        <w:t xml:space="preserve"> de générer une nouvelle paire clé/certificat. Cette commande utilise l’algorithme RSA avec une taille de clé de 2048 bits, ce qui constitue aujourd’hui un standard de sécurité courant. Le certificat est auto-signé grâce à l’option -x509, ce qui signifie qu’il est signé par sa propre clé privée et non par une autorité de certification externe.</w:t>
-      </w:r>
-    </w:p>
-    <w:p>
-      <w:pPr>
-        <w:pStyle w:val="Corpsdetexte"/>
-        <w:rPr>
-          <w:sz w:val="22"/>
-          <w:szCs w:val="22"/>
-        </w:rPr>
-      </w:pPr>
-    </w:p>
-    <w:p>
-      <w:pPr>
-        <w:pStyle w:val="Corpsdetexte"/>
-        <w:rPr>
-          <w:sz w:val="20"/>
-        </w:rPr>
-      </w:pPr>
-      <w:r>
-        <w:rPr>
-          <w:sz w:val="22"/>
-          <w:szCs w:val="22"/>
-        </w:rPr>
-        <w:t xml:space="preserve">La durée de validité du certificat est fixée à </w:t>
-      </w:r>
-      <w:r>
-        <w:rPr>
-          <w:sz w:val="22"/>
-          <w:szCs w:val="22"/>
-        </w:rPr>
-        <w:t>1 an</w:t>
-      </w:r>
-      <w:r>
-        <w:rPr>
-          <w:sz w:val="22"/>
-          <w:szCs w:val="22"/>
-        </w:rPr>
-        <w:t xml:space="preserve"> </w:t>
-      </w:r>
-      <w:r>
-        <w:rPr>
-          <w:sz w:val="22"/>
-          <w:szCs w:val="22"/>
-        </w:rPr>
-        <w:t>(-</w:t>
-      </w:r>
-      <w:proofErr w:type="spellStart"/>
-      <w:r>
-        <w:rPr>
-          <w:sz w:val="22"/>
-          <w:szCs w:val="22"/>
-        </w:rPr>
-        <w:t>days</w:t>
-      </w:r>
-      <w:proofErr w:type="spellEnd"/>
-      <w:r>
-        <w:rPr>
-          <w:sz w:val="22"/>
-          <w:szCs w:val="22"/>
-        </w:rPr>
-        <w:t xml:space="preserve"> 365). L’option -</w:t>
-      </w:r>
-      <w:proofErr w:type="spellStart"/>
-      <w:r>
-        <w:rPr>
-          <w:sz w:val="22"/>
-          <w:szCs w:val="22"/>
-        </w:rPr>
-        <w:t>nodes</w:t>
-      </w:r>
-      <w:proofErr w:type="spellEnd"/>
-      <w:r>
-        <w:rPr>
-          <w:sz w:val="22"/>
-          <w:szCs w:val="22"/>
-        </w:rPr>
-        <w:t xml:space="preserve"> permet de ne pas chiffrer la clé privée avec un mot de passe, ce qui simplifie son utilisation dans des environnements de test ou de développement. Enfin, le champ -subj permet de définir directement les informations d’identité du certificat (comme le nom commun CN=localhost, l’organisation et le pays), sans interaction utilisateur.</w:t>
-      </w:r>
-    </w:p>
-    <w:p>
-      <w:pPr>
-        <w:pStyle w:val="Corpsdetexte"/>
-        <w:ind w:left="0"/>
-      </w:pPr>
-    </w:p>
-    <w:p>
-      <w:pPr>
-        <w:pStyle w:val="Corpsdetexte"/>
-      </w:pPr>
-      <w:r>
-        <w:t>Une fois le certificat généré, plusieurs vérifications permettent de s’assurer de sa validité et de sa cohérence.</w:t>
-      </w:r>
-      <w:r>
-        <w:t xml:space="preserve"> On effectue plusieurs vérifications, on vérifie</w:t>
-      </w:r>
-      <w:r>
-        <w:t xml:space="preserve"> sa validité temporelle et son contenu,</w:t>
-      </w:r>
-      <w:r>
-        <w:t xml:space="preserve"> </w:t>
-      </w:r>
-      <w:r>
-        <w:t>sa conformité syntaxique</w:t>
-      </w:r>
-      <w:r>
-        <w:t xml:space="preserve"> </w:t>
-      </w:r>
-      <w:r>
-        <w:t xml:space="preserve">et sa cohérence avec la </w:t>
-      </w:r>
-      <w:r>
-        <w:t>correspondance clé/certificat, qui sera ensuite condensé à l’aide de la fonction de hachage MD5</w:t>
-      </w:r>
-      <w:r>
-        <w:t xml:space="preserve"> afin d’obtenir des empreintes comparables, si les deux sont identiques alors la paire est cohérente</w:t>
-      </w:r>
-      <w:r>
-        <w:t>.</w:t>
-      </w:r>
-    </w:p>
-    <w:p>
-      <w:pPr>
-        <w:pStyle w:val="Corpsdetexte"/>
-        <w:ind w:left="0"/>
-      </w:pPr>
-      <w:r>
-        <w:t>Ces étapes sont essentielles pour éviter des erreurs de configuration, notamment lors de la mise en place de connexions sécurisées (HTTPS, TLS)</w:t>
-      </w:r>
-      <w:r>
-        <w:t>.</w:t>
-      </w:r>
-    </w:p>
-    <w:p>
-      <w:pPr>
-        <w:pStyle w:val="Corpsdetexte"/>
-        <w:ind w:left="0"/>
-      </w:pPr>
-    </w:p>
-    <w:p>
-      <w:pPr>
-        <w:pStyle w:val="Titre3"/>
+        <w:t>5.</w:t>
+      </w:r>
+      <w:r>
         <w:rPr>
           <w:rFonts w:ascii="Aptos Display" w:hAnsi="Aptos Display"/>
           <w:b/>
           <w:bCs/>
           <w:color w:val="auto"/>
         </w:rPr>
-      </w:pPr>
+        <w:t>2</w:t>
+      </w:r>
       <w:r>
         <w:rPr>
           <w:rFonts w:ascii="Aptos Display" w:hAnsi="Aptos Display"/>
@@ -4737,7 +4760,7 @@
           <w:bCs/>
           <w:color w:val="auto"/>
         </w:rPr>
-        <w:t>5.</w:t>
+        <w:t xml:space="preserve">. </w:t>
       </w:r>
       <w:r>
         <w:rPr>
@@ -4746,7 +4769,7 @@
           <w:bCs/>
           <w:color w:val="auto"/>
         </w:rPr>
-        <w:t>2</w:t>
+        <w:t xml:space="preserve">Serveur web </w:t>
       </w:r>
       <w:r>
         <w:rPr>
@@ -4755,24 +4778,6 @@
           <w:bCs/>
           <w:color w:val="auto"/>
         </w:rPr>
-        <w:t xml:space="preserve">. </w:t>
-      </w:r>
-      <w:r>
-        <w:rPr>
-          <w:rFonts w:ascii="Aptos Display" w:hAnsi="Aptos Display"/>
-          <w:b/>
-          <w:bCs/>
-          <w:color w:val="auto"/>
-        </w:rPr>
-        <w:t xml:space="preserve">Serveur web </w:t>
-      </w:r>
-      <w:r>
-        <w:rPr>
-          <w:rFonts w:ascii="Aptos Display" w:hAnsi="Aptos Display"/>
-          <w:b/>
-          <w:bCs/>
-          <w:color w:val="auto"/>
-        </w:rPr>
         <w:t>HTTPS</w:t>
       </w:r>
     </w:p>
@@ -4790,13 +4795,7 @@
       </w:r>
       <w:proofErr w:type="spellEnd"/>
       <w:r>
-        <w:t xml:space="preserve"> activé afin de gérer les communications chiffrées via TLS.</w:t>
-      </w:r>
-      <w:r>
-        <w:t xml:space="preserve"> </w:t>
-      </w:r>
-      <w:r>
-        <w:t xml:space="preserve">Un </w:t>
+        <w:t xml:space="preserve"> activé afin de gérer les communications chiffrées via TLS. Un </w:t>
       </w:r>
       <w:proofErr w:type="spellStart"/>
       <w:r>
@@ -5008,49 +5007,13 @@
         <w:pStyle w:val="Corpsdetexte"/>
       </w:pPr>
       <w:r>
-        <w:t xml:space="preserve">Le certificat utilisé dans </w:t>
-      </w:r>
-      <w:r>
-        <w:t xml:space="preserve">le </w:t>
-      </w:r>
-      <w:r>
-        <w:t>HTTPS joue un double rôle essentiel</w:t>
-      </w:r>
-      <w:r>
-        <w:t xml:space="preserve">, </w:t>
+        <w:t xml:space="preserve">Le certificat utilisé dans le HTTPS joue un double rôle essentiel, </w:t>
       </w:r>
       <w:r>
         <w:t xml:space="preserve">car </w:t>
       </w:r>
       <w:r>
-        <w:t>il permet l’a</w:t>
-      </w:r>
-      <w:r>
-        <w:t>uthentification du serveur</w:t>
-      </w:r>
-      <w:r>
-        <w:t xml:space="preserve"> avec un</w:t>
-      </w:r>
-      <w:r>
-        <w:t xml:space="preserve"> client (navigateur) </w:t>
-      </w:r>
-      <w:r>
-        <w:t xml:space="preserve">qui </w:t>
-      </w:r>
-      <w:r>
-        <w:t>vérifie qu’il communique bien avec le bon serveur, grâce au certificat X.509 présenté</w:t>
-      </w:r>
-      <w:r>
-        <w:t>, mais également de garantir une c</w:t>
-      </w:r>
-      <w:r>
-        <w:t>onfidentialité des échanges</w:t>
-      </w:r>
-      <w:r>
-        <w:t>, car u</w:t>
-      </w:r>
-      <w:r>
-        <w:t>ne fois la connexion établie, le protocole TLS chiffre toutes les données échangées entre le client et le serveur.</w:t>
+        <w:t>il permet l’authentification du serveur avec un client (navigateur) qui vérifie qu’il communique bien avec le bon serveur, grâce au certificat X.509 présenté, mais également de garantir une confidentialité des échanges, car une fois la connexion établie, le protocole TLS chiffre toutes les données échangées entre le client et le serveur.</w:t>
       </w:r>
     </w:p>
     <w:p>
@@ -5290,54 +5253,14 @@
     </w:p>
     <w:p/>
     <w:p>
+      <w:pPr>
+        <w:rPr>
+          <w:rFonts w:ascii="Segoe UI" w:hAnsi="Segoe UI"/>
+        </w:rPr>
+      </w:pPr>
       <w:r>
         <w:t>Au-delà de la simple correction de failles, ce projet illustre une démarche de sécurité en profondeur où chaque couche — base de données, logique applicative, authentification, transport et supervision — joue un rôle complémentaire et indispensable face aux menaces actuelles.</w:t>
       </w:r>
-    </w:p>
-    <w:p>
-      <w:pPr>
-        <w:sectPr>
-          <w:pgSz w:w="11910" w:h="16840"/>
-          <w:pgMar w:top="1440" w:right="708" w:bottom="280" w:left="1417" w:header="720" w:footer="720" w:gutter="0"/>
-          <w:cols w:space="720"/>
-        </w:sectPr>
-      </w:pPr>
-    </w:p>
-    <w:p>
-      <w:pPr>
-        <w:pStyle w:val="Corpsdetexte"/>
-        <w:ind w:left="0"/>
-        <w:rPr>
-          <w:sz w:val="20"/>
-        </w:rPr>
-        <w:sectPr>
-          <w:pgSz w:w="11910" w:h="16840"/>
-          <w:pgMar w:top="1440" w:right="708" w:bottom="280" w:left="1417" w:header="720" w:footer="720" w:gutter="0"/>
-          <w:cols w:space="720"/>
-        </w:sectPr>
-      </w:pPr>
-    </w:p>
-    <w:p>
-      <w:pPr>
-        <w:rPr>
-          <w:sz w:val="24"/>
-        </w:rPr>
-        <w:sectPr>
-          <w:pgSz w:w="11910" w:h="16840"/>
-          <w:pgMar w:top="1360" w:right="708" w:bottom="280" w:left="1417" w:header="720" w:footer="720" w:gutter="0"/>
-          <w:cols w:space="720"/>
-        </w:sectPr>
-      </w:pPr>
-    </w:p>
-    <w:p>
-      <w:pPr>
-        <w:pStyle w:val="Corpsdetexte"/>
-        <w:spacing w:before="245"/>
-        <w:ind w:left="0"/>
-        <w:rPr>
-          <w:rFonts w:ascii="Segoe UI" w:hAnsi="Segoe UI"/>
-        </w:rPr>
-      </w:pPr>
     </w:p>
     <w:sectPr>
       <w:pgSz w:w="11910" w:h="16840"/>
@@ -6859,6 +6782,7 @@
   <w:style w:type="character" w:default="1" w:styleId="Policepardfaut">
     <w:name w:val="Default Paragraph Font"/>
     <w:uiPriority w:val="1"/>
+    <w:semiHidden/>
     <w:unhideWhenUsed/>
   </w:style>
   <w:style w:type="table" w:default="1" w:styleId="TableauNormal">
@@ -7187,8 +7111,10 @@
     <w:rsid w:val="006F78FD"/>
     <w:rsid w:val="007633CD"/>
     <w:rsid w:val="0087582C"/>
+    <w:rsid w:val="00B33E1A"/>
     <w:rsid w:val="00C83587"/>
     <w:rsid w:val="00CC66EB"/>
+    <w:rsid w:val="00D0489A"/>
     <w:rsid w:val="00D72333"/>
   </w:rsids>
   <m:mathPr>

</xml_diff>